<commit_message>
59853fe5d16b41b11d6c41f510cd909c7e58d5a3 deploy: siteground artifact
</commit_message>
<xml_diff>
--- a/hub/manuals/calendar-admin.docx
+++ b/hub/manuals/calendar-admin.docx
@@ -684,7 +684,17 @@
         <w:t xml:space="preserve">Planning</w:t>
       </w:r>
       <w:r>
-        <w:t xml:space="preserve"> reports. Editors and above create, change and clone their ministries' activities. HQ staff at Advanced and above also have </w:t>
+        <w:t xml:space="preserve"> reports. Editors and above create, change and clone their ministries' activities. HQ staff at Editor and above also have </w:t>
+      </w:r>
+      <w:r>
+        <w:rPr>
+          <w:b/>
+          <w:bCs/>
+        </w:rPr>
+        <w:t xml:space="preserve">Clear LA Status</w:t>
+      </w:r>
+      <w:r>
+        <w:t xml:space="preserve">, and HQ staff at Advanced and above also have </w:t>
       </w:r>
       <w:r>
         <w:rPr>
@@ -4296,6 +4306,20 @@
       </w:r>
       <w:r>
         <w:t xml:space="preserve"> on an activity. You can delete an activity your ministry leads. HQ Administrators can delete any activity. A ministry that is only shared on an activity can't delete it.</w:t>
+      </w:r>
+    </w:p>
+    <w:p>
+      <w:pPr>
+        <w:spacing w:after="120"/>
+      </w:pPr>
+      <w:r>
+        <w:t xml:space="preserve">Adding, changing and cloning activities is the same for you as for advanced users: see </w:t>
+      </w:r>
+      <w:r>
+        <w:t xml:space="preserve">Add or change an activity</w:t>
+      </w:r>
+      <w:r>
+        <w:t xml:space="preserve">.</w:t>
       </w:r>
     </w:p>
     <w:p>

</xml_diff>

<commit_message>
67d80395f1b7e7cca34a78c6b5acc6a5fa759839 deploy: siteground artifact
</commit_message>
<xml_diff>
--- a/hub/manuals/calendar-admin.docx
+++ b/hub/manuals/calendar-admin.docx
@@ -76,7 +76,7 @@
           <w:sz w:val="24"/>
           <w:szCs w:val="24"/>
         </w:rPr>
-        <w:t xml:space="preserve">Software version of October 30, 2026</w:t>
+        <w:t xml:space="preserve">Software version of October 31, 2026</w:t>
       </w:r>
     </w:p>
     <w:p>
@@ -711,7 +711,7 @@
           <w:b/>
           <w:bCs/>
         </w:rPr>
-        <w:t xml:space="preserve">Look Ahead filter</w:t>
+        <w:t xml:space="preserve">Confidential filter</w:t>
       </w:r>
       <w:r>
         <w:t xml:space="preserve"> and </w:t>
@@ -2145,7 +2145,7 @@
           <w:b/>
           <w:bCs/>
         </w:rPr>
-        <w:t xml:space="preserve">Comm. Contact</w:t>
+        <w:t xml:space="preserve">Comm Contact</w:t>
       </w:r>
       <w:r>
         <w:t xml:space="preserve"> column and in the Excel export.</w:t>
@@ -2294,17 +2294,17 @@
         <w:spacing w:after="120"/>
       </w:pPr>
       <w:r>
-        <w:t xml:space="preserve">"Give this user a ministry first." means they have no ministry yet. Give them one under </w:t>
-      </w:r>
-      <w:r>
-        <w:rPr>
-          <w:b/>
-          <w:bCs/>
-        </w:rPr>
-        <w:t xml:space="preserve">Calendar access</w:t>
-      </w:r>
-      <w:r>
-        <w:t xml:space="preserve">, wait a minute, then reload the page.</w:t>
+        <w:t xml:space="preserve">"Give this user a ministry under Calendar access (Edit Calendar access) first." means they have no ministry yet. Choose </w:t>
+      </w:r>
+      <w:r>
+        <w:rPr>
+          <w:b/>
+          <w:bCs/>
+        </w:rPr>
+        <w:t xml:space="preserve">Edit Calendar access</w:t>
+      </w:r>
+      <w:r>
+        <w:t xml:space="preserve"> above and give them one, wait a minute, then reload the page.</w:t>
       </w:r>
     </w:p>
     <w:p>
@@ -2418,7 +2418,27 @@
         <w:t xml:space="preserve">Transfer their activities first</w:t>
       </w:r>
       <w:r>
-        <w:t xml:space="preserve">. See </w:t>
+        <w:t xml:space="preserve">. </w:t>
+      </w:r>
+      <w:r>
+        <w:rPr>
+          <w:b/>
+          <w:bCs/>
+        </w:rPr>
+        <w:t xml:space="preserve">Transfer</w:t>
+      </w:r>
+      <w:r>
+        <w:t xml:space="preserve"> opens with them already chosen as </w:t>
+      </w:r>
+      <w:r>
+        <w:rPr>
+          <w:b/>
+          <w:bCs/>
+        </w:rPr>
+        <w:t xml:space="preserve">From comm contact</w:t>
+      </w:r>
+      <w:r>
+        <w:t xml:space="preserve"> when they are a comm contact for one ministry; for several, choose which. See </w:t>
       </w:r>
       <w:hyperlink w:history="1" w:anchor="section_4">
         <w:r>
@@ -2986,7 +3006,17 @@
         <w:t xml:space="preserve">From comm contact</w:t>
       </w:r>
       <w:r>
-        <w:t xml:space="preserve">. Contacts who are no longer active, or whose account is inactive, are marked "— inactive".</w:t>
+        <w:t xml:space="preserve">. Contacts who are no longer active, or whose account is inactive, are marked "— inactive". If you came from </w:t>
+      </w:r>
+      <w:r>
+        <w:rPr>
+          <w:b/>
+          <w:bCs/>
+        </w:rPr>
+        <w:t xml:space="preserve">Transfer their activities first</w:t>
+      </w:r>
+      <w:r>
+        <w:t xml:space="preserve"> on a user's page, that person is already chosen when they are a comm contact for one ministry. If they are a comm contact for several, it says "They are a comm contact for more than one ministry: choose which."</w:t>
       </w:r>
     </w:p>
     <w:p>
@@ -5259,17 +5289,17 @@
           <w:b/>
           <w:bCs/>
         </w:rPr>
-        <w:t xml:space="preserve">Look Ahead filter</w:t>
-      </w:r>
-      <w:r>
-        <w:t xml:space="preserve"> above the list narrows it to </w:t>
-      </w:r>
-      <w:r>
-        <w:rPr>
-          <w:b/>
-          <w:bCs/>
-        </w:rPr>
-        <w:t xml:space="preserve">Look Ahead Only</w:t>
+        <w:t xml:space="preserve">Confidential filter</w:t>
+      </w:r>
+      <w:r>
+        <w:t xml:space="preserve"> above the list (the old Calendar's Look Ahead filter) narrows it to </w:t>
+      </w:r>
+      <w:r>
+        <w:rPr>
+          <w:b/>
+          <w:bCs/>
+        </w:rPr>
+        <w:t xml:space="preserve">Not confidential only</w:t>
       </w:r>
       <w:r>
         <w:t xml:space="preserve"> or </w:t>
@@ -5279,7 +5309,7 @@
           <w:b/>
           <w:bCs/>
         </w:rPr>
-        <w:t xml:space="preserve">Not for Look Ahead Only</w:t>
+        <w:t xml:space="preserve">Confidential only</w:t>
       </w:r>
       <w:r>
         <w:t xml:space="preserve">. </w:t>
@@ -5292,7 +5322,17 @@
         <w:t xml:space="preserve">Show All</w:t>
       </w:r>
       <w:r>
-        <w:t xml:space="preserve"> turns it off.</w:t>
+        <w:t xml:space="preserve"> turns it off. The line beside </w:t>
+      </w:r>
+      <w:r>
+        <w:rPr>
+          <w:b/>
+          <w:bCs/>
+        </w:rPr>
+        <w:t xml:space="preserve">Filters</w:t>
+      </w:r>
+      <w:r>
+        <w:t xml:space="preserve"> names the choice while it is on.</w:t>
       </w:r>
     </w:p>
     <w:p>

</xml_diff>

<commit_message>
7f190ac81540b20283a57ef23638d439ac2013e5 deploy: siteground artifact
</commit_message>
<xml_diff>
--- a/hub/manuals/calendar-admin.docx
+++ b/hub/manuals/calendar-admin.docx
@@ -2268,7 +2268,7 @@
         </w:numPr>
       </w:pPr>
       <w:r>
-        <w:t xml:space="preserve">The rank saves as soon as you choose it. You see "Saved the comm-contact rank."</w:t>
+        <w:t xml:space="preserve">The rank saves as soon as you choose it. Beside the box you see, for example, "Saved: Comm Director for Health (HLTH)." If it doesn't save, the same place says why, such as "The rank wasn't saved. Try again."</w:t>
       </w:r>
     </w:p>
     <w:p>
@@ -4909,7 +4909,117 @@
         <w:t xml:space="preserve">Reviewed</w:t>
       </w:r>
       <w:r>
-        <w:t xml:space="preserve"> and clears its "changed" marks. If you have unsaved changes, save or cancel them first; the page says "Save or cancel your changes to review or clone."</w:t>
+        <w:t xml:space="preserve"> and clears its "changed" marks. If you have unsaved changes, save or cancel them first; the page says "Save or cancel your changes to review or clone, or choose Save and review." </w:t>
+      </w:r>
+      <w:r>
+        <w:rPr>
+          <w:b/>
+          <w:bCs/>
+        </w:rPr>
+        <w:t xml:space="preserve">Save and review</w:t>
+      </w:r>
+      <w:r>
+        <w:t xml:space="preserve"> saves them and reviews in one step.</w:t>
+      </w:r>
+    </w:p>
+    <w:p>
+      <w:pPr>
+        <w:pStyle w:val="Heading2"/>
+      </w:pPr>
+      <w:r>
+        <w:t xml:space="preserve">Save and review</w:t>
+      </w:r>
+    </w:p>
+    <w:p>
+      <w:pPr>
+        <w:spacing w:after="120"/>
+      </w:pPr>
+      <w:r>
+        <w:t xml:space="preserve">When you change an activity yourself, your save marks your own changes "Changed: needs review". </w:t>
+      </w:r>
+      <w:r>
+        <w:rPr>
+          <w:b/>
+          <w:bCs/>
+        </w:rPr>
+        <w:t xml:space="preserve">Save and review</w:t>
+      </w:r>
+      <w:r>
+        <w:t xml:space="preserve">, beside </w:t>
+      </w:r>
+      <w:r>
+        <w:rPr>
+          <w:b/>
+          <w:bCs/>
+        </w:rPr>
+        <w:t xml:space="preserve">Save</w:t>
+      </w:r>
+      <w:r>
+        <w:t xml:space="preserve">, saves your changes and then marks the activity </w:t>
+      </w:r>
+      <w:r>
+        <w:rPr>
+          <w:b/>
+          <w:bCs/>
+        </w:rPr>
+        <w:t xml:space="preserve">Reviewed</w:t>
+      </w:r>
+      <w:r>
+        <w:t xml:space="preserve">, as </w:t>
+      </w:r>
+      <w:r>
+        <w:rPr>
+          <w:b/>
+          <w:bCs/>
+        </w:rPr>
+        <w:t xml:space="preserve">Save</w:t>
+      </w:r>
+      <w:r>
+        <w:t xml:space="preserve"> followed by </w:t>
+      </w:r>
+      <w:r>
+        <w:rPr>
+          <w:b/>
+          <w:bCs/>
+        </w:rPr>
+        <w:t xml:space="preserve">Review</w:t>
+      </w:r>
+      <w:r>
+        <w:t xml:space="preserve"> would. You are back on the list and see, for example, "Saved and reviewed HLTH-1." ⌘S or Ctrl+S is still a plain </w:t>
+      </w:r>
+      <w:r>
+        <w:rPr>
+          <w:b/>
+          <w:bCs/>
+        </w:rPr>
+        <w:t xml:space="preserve">Save</w:t>
+      </w:r>
+      <w:r>
+        <w:t xml:space="preserve">.</w:t>
+      </w:r>
+    </w:p>
+    <w:p>
+      <w:pPr>
+        <w:pStyle w:val="ListParagraph"/>
+        <w:numPr>
+          <w:ilvl w:val="0"/>
+          <w:numId w:val="1"/>
+        </w:numPr>
+      </w:pPr>
+      <w:r>
+        <w:t xml:space="preserve">If the save finds a problem, nothing is reviewed and your changes stay on screen.</w:t>
+      </w:r>
+    </w:p>
+    <w:p>
+      <w:pPr>
+        <w:pStyle w:val="ListParagraph"/>
+        <w:numPr>
+          <w:ilvl w:val="0"/>
+          <w:numId w:val="1"/>
+        </w:numPr>
+      </w:pPr>
+      <w:r>
+        <w:t xml:space="preserve">If the save works but the review doesn't, the activity stays saved and open, and the page says so, for example "Saved HLTH-1, but it wasn't marked reviewed: someone changed it in between. Reload to see their change, then choose Review."</w:t>
       </w:r>
     </w:p>
     <w:p>

</xml_diff>

<commit_message>
b43ae5cbf1d67e41a3121c31e262453722681252 deploy: siteground artifact
</commit_message>
<xml_diff>
--- a/hub/manuals/calendar-admin.docx
+++ b/hub/manuals/calendar-admin.docx
@@ -2304,7 +2304,15 @@
         <w:t xml:space="preserve">Edit Calendar access</w:t>
       </w:r>
       <w:r>
-        <w:t xml:space="preserve"> above and give them one, wait a minute, then reload the page.</w:t>
+        <w:t xml:space="preserve"> above and give them one.</w:t>
+      </w:r>
+    </w:p>
+    <w:p>
+      <w:pPr>
+        <w:spacing w:after="120"/>
+      </w:pPr>
+      <w:r>
+        <w:t xml:space="preserve">Just after you give someone a ministry, or take one away, the page says "Updating their ministries in the Calendar… This page catches up by itself in a moment." Stay on the page: the rank boxes follow by themselves, usually within a minute. If they haven't after about a minute and a half, the page says "The Calendar hasn't picked up their ministry changes yet. Reload the page in a minute."</w:t>
       </w:r>
     </w:p>
     <w:p>
@@ -2880,7 +2888,7 @@
         <w:tc>
           <w:p>
             <w:r>
-              <w:t xml:space="preserve">That ministry was only just given. Wait a minute, reload, and choose the rank again.</w:t>
+              <w:t xml:space="preserve">That ministry was only just given, or taken away, in another window. Reload the page, and choose the rank again once its box appears.</w:t>
             </w:r>
           </w:p>
         </w:tc>
@@ -5115,6 +5123,16 @@
         <w:t xml:space="preserve">Review selected</w:t>
       </w:r>
       <w:r>
+        <w:t xml:space="preserve">, beside </w:t>
+      </w:r>
+      <w:r>
+        <w:rPr>
+          <w:b/>
+          <w:bCs/>
+        </w:rPr>
+        <w:t xml:space="preserve">New activity</w:t>
+      </w:r>
+      <w:r>
         <w:t xml:space="preserve">. The button shows how many are ticked, up to 500 at a time.</w:t>
       </w:r>
     </w:p>
@@ -5127,6 +5145,38 @@
         </w:numPr>
       </w:pPr>
       <w:r>
+        <w:t xml:space="preserve">The Hub asks first, for example "Review 3 activities?": "Their “Changed: needs review” marks are cleared and they become Reviewed. This can’t be undone." Choose </w:t>
+      </w:r>
+      <w:r>
+        <w:rPr>
+          <w:b/>
+          <w:bCs/>
+        </w:rPr>
+        <w:t xml:space="preserve">Review</w:t>
+      </w:r>
+      <w:r>
+        <w:t xml:space="preserve">, or </w:t>
+      </w:r>
+      <w:r>
+        <w:rPr>
+          <w:b/>
+          <w:bCs/>
+        </w:rPr>
+        <w:t xml:space="preserve">Cancel</w:t>
+      </w:r>
+      <w:r>
+        <w:t xml:space="preserve"> to review nothing.</w:t>
+      </w:r>
+    </w:p>
+    <w:p>
+      <w:pPr>
+        <w:pStyle w:val="ListParagraph"/>
+        <w:numPr>
+          <w:ilvl w:val="0"/>
+          <w:numId w:val="13"/>
+        </w:numPr>
+      </w:pPr>
+      <w:r>
         <w:t xml:space="preserve">You see, for example, "Reviewed 3 activities."</w:t>
       </w:r>
     </w:p>
@@ -5502,7 +5552,27 @@
         <w:t xml:space="preserve">Export and reports</w:t>
       </w:r>
       <w:r>
-        <w:t xml:space="preserve">.</w:t>
+        <w:t xml:space="preserve">, and check the filter it says it will use, such as "Uses your list filter: none (every activity you can see)." It warns you when a </w:t>
+      </w:r>
+      <w:r>
+        <w:rPr>
+          <w:b/>
+          <w:bCs/>
+        </w:rPr>
+        <w:t xml:space="preserve">Display</w:t>
+      </w:r>
+      <w:r>
+        <w:t xml:space="preserve"> choice kept from last time, or an activity number in </w:t>
+      </w:r>
+      <w:r>
+        <w:rPr>
+          <w:b/>
+          <w:bCs/>
+        </w:rPr>
+        <w:t xml:space="preserve">Search for</w:t>
+      </w:r>
+      <w:r>
+        <w:t xml:space="preserve">, narrows it.</w:t>
       </w:r>
     </w:p>
     <w:p>
@@ -5532,7 +5602,7 @@
         <w:spacing w:after="120"/>
       </w:pPr>
       <w:r>
-        <w:t xml:space="preserve">Each activity shows its title, summary, significance, city and venue, and when it was last updated. With no </w:t>
+        <w:t xml:space="preserve">Under its heading the report says which filter it used, for example "Filter: Dates: 2026-11-01 to 2026-11-30". Each activity shows its title, summary, significance, city and venue, and when it was last updated. With no </w:t>
       </w:r>
       <w:r>
         <w:rPr>

</xml_diff>

<commit_message>
eed69eb5e634c7ef712bca52e4632e2fea4ff7eb deploy: siteground artifact
</commit_message>
<xml_diff>
--- a/hub/manuals/calendar-admin.docx
+++ b/hub/manuals/calendar-admin.docx
@@ -943,6 +943,30 @@
     </w:p>
     <w:p>
       <w:pPr>
+        <w:pStyle w:val="Heading2"/>
+      </w:pPr>
+      <w:r>
+        <w:t xml:space="preserve">Signing in and unsaved changes</w:t>
+      </w:r>
+    </w:p>
+    <w:p>
+      <w:pPr>
+        <w:spacing w:after="120"/>
+      </w:pPr>
+      <w:r>
+        <w:t xml:space="preserve">The Hub keeps you signed in while its tab is open. </w:t>
+      </w:r>
+      <w:hyperlink w:history="1" w:anchor="section_9">
+        <w:r>
+          <w:t xml:space="preserve">Staying signed in, and unsaved changes</w:t>
+        </w:r>
+      </w:hyperlink>
+      <w:r>
+        <w:t xml:space="preserve"> says what happens when your session ends, and how the Hub asks before you lose changes you haven't saved.</w:t>
+      </w:r>
+    </w:p>
+    <w:p>
+      <w:pPr>
         <w:pStyle w:val="Heading1"/>
       </w:pPr>
       <w:bookmarkStart w:name="section_2" w:id="2"/>
@@ -1699,6 +1723,52 @@
         <w:pStyle w:val="Heading2"/>
       </w:pPr>
       <w:r>
+        <w:t xml:space="preserve">If you leave before saving</w:t>
+      </w:r>
+    </w:p>
+    <w:p>
+      <w:pPr>
+        <w:spacing w:after="120"/>
+      </w:pPr>
+      <w:r>
+        <w:t xml:space="preserve">If you have changes you haven't saved and you go to another screen or choose your browser's </w:t>
+      </w:r>
+      <w:r>
+        <w:rPr>
+          <w:b/>
+          <w:bCs/>
+        </w:rPr>
+        <w:t xml:space="preserve">Back</w:t>
+      </w:r>
+      <w:r>
+        <w:t xml:space="preserve">, the Hub asks "You have unsaved changes on this page. Leave anyway and discard them?" Choose </w:t>
+      </w:r>
+      <w:r>
+        <w:rPr>
+          <w:b/>
+          <w:bCs/>
+        </w:rPr>
+        <w:t xml:space="preserve">Stay</w:t>
+      </w:r>
+      <w:r>
+        <w:t xml:space="preserve"> to keep working, or </w:t>
+      </w:r>
+      <w:r>
+        <w:rPr>
+          <w:b/>
+          <w:bCs/>
+        </w:rPr>
+        <w:t xml:space="preserve">Leave</w:t>
+      </w:r>
+      <w:r>
+        <w:t xml:space="preserve"> to discard the changes. Closing or reloading the tab gets your browser's own question.</w:t>
+      </w:r>
+    </w:p>
+    <w:p>
+      <w:pPr>
+        <w:pStyle w:val="Heading2"/>
+      </w:pPr>
+      <w:r>
         <w:t xml:space="preserve">Can't do this?</w:t>
       </w:r>
     </w:p>
@@ -2754,6 +2824,52 @@
       </w:pPr>
       <w:r>
         <w:t xml:space="preserve">If the person's access changed a moment ago, the same message can appear after you choose the button instead.</w:t>
+      </w:r>
+    </w:p>
+    <w:p>
+      <w:pPr>
+        <w:pStyle w:val="Heading2"/>
+      </w:pPr>
+      <w:r>
+        <w:t xml:space="preserve">If you leave before saving</w:t>
+      </w:r>
+    </w:p>
+    <w:p>
+      <w:pPr>
+        <w:spacing w:after="120"/>
+      </w:pPr>
+      <w:r>
+        <w:t xml:space="preserve">If you have changes you haven't saved and you go to another screen or choose your browser's </w:t>
+      </w:r>
+      <w:r>
+        <w:rPr>
+          <w:b/>
+          <w:bCs/>
+        </w:rPr>
+        <w:t xml:space="preserve">Back</w:t>
+      </w:r>
+      <w:r>
+        <w:t xml:space="preserve">, the Hub asks "You have unsaved changes on this page. Leave anyway and discard them?" Choose </w:t>
+      </w:r>
+      <w:r>
+        <w:rPr>
+          <w:b/>
+          <w:bCs/>
+        </w:rPr>
+        <w:t xml:space="preserve">Stay</w:t>
+      </w:r>
+      <w:r>
+        <w:t xml:space="preserve"> to keep working, or </w:t>
+      </w:r>
+      <w:r>
+        <w:rPr>
+          <w:b/>
+          <w:bCs/>
+        </w:rPr>
+        <w:t xml:space="preserve">Leave</w:t>
+      </w:r>
+      <w:r>
+        <w:t xml:space="preserve"> to discard the changes. Closing or reloading the tab gets your browser's own question.</w:t>
       </w:r>
     </w:p>
     <w:p>
@@ -4121,6 +4237,42 @@
         <w:pStyle w:val="Heading2"/>
       </w:pPr>
       <w:r>
+        <w:t xml:space="preserve">If you leave before saving</w:t>
+      </w:r>
+    </w:p>
+    <w:p>
+      <w:pPr>
+        <w:spacing w:after="120"/>
+      </w:pPr>
+      <w:r>
+        <w:t xml:space="preserve">If you have changed a row, or typed in the add form, and not saved it, the Hub asks before you go to another screen: "You have unsaved changes on this page. Leave anyway and discard them?" Choose </w:t>
+      </w:r>
+      <w:r>
+        <w:rPr>
+          <w:b/>
+          <w:bCs/>
+        </w:rPr>
+        <w:t xml:space="preserve">Stay</w:t>
+      </w:r>
+      <w:r>
+        <w:t xml:space="preserve"> to keep working, or </w:t>
+      </w:r>
+      <w:r>
+        <w:rPr>
+          <w:b/>
+          <w:bCs/>
+        </w:rPr>
+        <w:t xml:space="preserve">Leave</w:t>
+      </w:r>
+      <w:r>
+        <w:t xml:space="preserve"> to discard the changes. Closing or reloading the tab gets your browser's own question.</w:t>
+      </w:r>
+    </w:p>
+    <w:p>
+      <w:pPr>
+        <w:pStyle w:val="Heading2"/>
+      </w:pPr>
+      <w:r>
         <w:t xml:space="preserve">Can't do this?</w:t>
       </w:r>
     </w:p>
@@ -5978,6 +6130,291 @@
       </w:pPr>
       <w:r>
         <w:t xml:space="preserve">Retrying an old change is safe. If a newer change to the same activity has already reached Releases, the newer one stays.</w:t>
+      </w:r>
+    </w:p>
+    <w:p>
+      <w:pPr>
+        <w:pStyle w:val="Heading1"/>
+        <w:pageBreakBefore/>
+      </w:pPr>
+      <w:r>
+        <w:t xml:space="preserve">Topics</w:t>
+      </w:r>
+    </w:p>
+    <w:p>
+      <w:pPr>
+        <w:pStyle w:val="Heading2"/>
+      </w:pPr>
+      <w:bookmarkStart w:name="section_9" w:id="9"/>
+      <w:r>
+        <w:t xml:space="preserve">Staying signed in, and unsaved changes</w:t>
+      </w:r>
+      <w:bookmarkEnd w:id="9"/>
+    </w:p>
+    <w:p>
+      <w:pPr>
+        <w:spacing w:after="120"/>
+      </w:pPr>
+      <w:r>
+        <w:rPr>
+          <w:b/>
+          <w:bCs/>
+        </w:rPr>
+        <w:t xml:space="preserve">Who this is for:</w:t>
+      </w:r>
+      <w:r>
+        <w:t xml:space="preserve"> Everyone who uses the Hub.</w:t>
+      </w:r>
+    </w:p>
+    <w:p>
+      <w:pPr>
+        <w:pStyle w:val="Heading3"/>
+      </w:pPr>
+      <w:r>
+        <w:t xml:space="preserve">Staying signed in</w:t>
+      </w:r>
+    </w:p>
+    <w:p>
+      <w:pPr>
+        <w:spacing w:after="120"/>
+      </w:pPr>
+      <w:r>
+        <w:t xml:space="preserve">While a Hub tab is open, it keeps you signed in, even when the tab sits behind other windows. Your session can still end: when you sign out in another tab or window, when your computer has been asleep or offline for a while (it can be as little as a few minutes, and is never more than an hour), when the browser has put a tab it hasn't shown for a long time to sleep, or when an administrator changes your account.</w:t>
+      </w:r>
+    </w:p>
+    <w:p>
+      <w:pPr>
+        <w:pStyle w:val="Heading3"/>
+      </w:pPr>
+      <w:r>
+        <w:t xml:space="preserve">When your session ends</w:t>
+      </w:r>
+    </w:p>
+    <w:p>
+      <w:pPr>
+        <w:spacing w:after="120"/>
+      </w:pPr>
+      <w:r>
+        <w:t xml:space="preserve">If the screen you are on has nothing unsaved, the Hub goes to the sign-in page, which says "Your session ended. Sign in to carry on where you left off." Once you sign in, you are back where you were.</w:t>
+      </w:r>
+    </w:p>
+    <w:p>
+      <w:pPr>
+        <w:spacing w:after="120"/>
+      </w:pPr>
+      <w:r>
+        <w:t xml:space="preserve">If the screen has unsaved changes, it stays as it was, and a box says "Your session has ended". Nothing can be saved until you sign in again: if you choose a button that saves, the screen says "Your session has ended. Sign in again to save — your changes are still here." and the box comes back.</w:t>
+      </w:r>
+    </w:p>
+    <w:p>
+      <w:pPr>
+        <w:pStyle w:val="ListParagraph"/>
+        <w:numPr>
+          <w:ilvl w:val="0"/>
+          <w:numId w:val="1"/>
+        </w:numPr>
+      </w:pPr>
+      <w:r>
+        <w:t xml:space="preserve">Choose </w:t>
+      </w:r>
+      <w:r>
+        <w:rPr>
+          <w:b/>
+          <w:bCs/>
+        </w:rPr>
+        <w:t xml:space="preserve">Sign in again</w:t>
+      </w:r>
+      <w:r>
+        <w:t xml:space="preserve"> to go to the sign-in page. Afterwards you come back to the same screen. Changes to a release's documents and to a Calendar activity are kept on this computer and come back, with "Your unsaved changes were restored." Other unsaved changes are lost.</w:t>
+      </w:r>
+    </w:p>
+    <w:p>
+      <w:pPr>
+        <w:pStyle w:val="ListParagraph"/>
+        <w:numPr>
+          <w:ilvl w:val="0"/>
+          <w:numId w:val="1"/>
+        </w:numPr>
+      </w:pPr>
+      <w:r>
+        <w:t xml:space="preserve">Choose </w:t>
+      </w:r>
+      <w:r>
+        <w:rPr>
+          <w:b/>
+          <w:bCs/>
+        </w:rPr>
+        <w:t xml:space="preserve">Stay on this page</w:t>
+      </w:r>
+      <w:r>
+        <w:t xml:space="preserve"> to copy what you need first. "Your session has ended" stays at the top of the page, with its own </w:t>
+      </w:r>
+      <w:r>
+        <w:rPr>
+          <w:b/>
+          <w:bCs/>
+        </w:rPr>
+        <w:t xml:space="preserve">Sign in again</w:t>
+      </w:r>
+      <w:r>
+        <w:t xml:space="preserve">.</w:t>
+      </w:r>
+    </w:p>
+    <w:p>
+      <w:pPr>
+        <w:pStyle w:val="ListParagraph"/>
+        <w:numPr>
+          <w:ilvl w:val="0"/>
+          <w:numId w:val="1"/>
+        </w:numPr>
+      </w:pPr>
+      <w:r>
+        <w:t xml:space="preserve">Or sign in again in another tab. Come back to this tab and you can save as usual.</w:t>
+      </w:r>
+    </w:p>
+    <w:p>
+      <w:pPr>
+        <w:pStyle w:val="Heading3"/>
+      </w:pPr>
+      <w:r>
+        <w:t xml:space="preserve">Leaving a screen with unsaved changes</w:t>
+      </w:r>
+    </w:p>
+    <w:p>
+      <w:pPr>
+        <w:spacing w:after="120"/>
+      </w:pPr>
+      <w:r>
+        <w:t xml:space="preserve">On every screen where you change something, the Hub asks before you leave with changes you haven't saved: "You have unsaved changes on this page. Leave anyway and discard them?" This covers the side menu, links, </w:t>
+      </w:r>
+      <w:r>
+        <w:rPr>
+          <w:b/>
+          <w:bCs/>
+        </w:rPr>
+        <w:t xml:space="preserve">Help</w:t>
+      </w:r>
+      <w:r>
+        <w:t xml:space="preserve"> and your browser's </w:t>
+      </w:r>
+      <w:r>
+        <w:rPr>
+          <w:b/>
+          <w:bCs/>
+        </w:rPr>
+        <w:t xml:space="preserve">Back</w:t>
+      </w:r>
+      <w:r>
+        <w:t xml:space="preserve">. Choose </w:t>
+      </w:r>
+      <w:r>
+        <w:rPr>
+          <w:b/>
+          <w:bCs/>
+        </w:rPr>
+        <w:t xml:space="preserve">Stay</w:t>
+      </w:r>
+      <w:r>
+        <w:t xml:space="preserve"> to keep working, or </w:t>
+      </w:r>
+      <w:r>
+        <w:rPr>
+          <w:b/>
+          <w:bCs/>
+        </w:rPr>
+        <w:t xml:space="preserve">Leave</w:t>
+      </w:r>
+      <w:r>
+        <w:t xml:space="preserve"> to discard the changes. Closing or reloading the tab gets your browser's own question.</w:t>
+      </w:r>
+    </w:p>
+    <w:p>
+      <w:pPr>
+        <w:spacing w:after="120"/>
+      </w:pPr>
+      <w:r>
+        <w:rPr>
+          <w:b/>
+          <w:bCs/>
+        </w:rPr>
+        <w:t xml:space="preserve">Sign out</w:t>
+      </w:r>
+      <w:r>
+        <w:t xml:space="preserve"> asks too: "You have unsaved changes on this page. Sign out anyway and discard them?" Choose </w:t>
+      </w:r>
+      <w:r>
+        <w:rPr>
+          <w:b/>
+          <w:bCs/>
+        </w:rPr>
+        <w:t xml:space="preserve">Stay</w:t>
+      </w:r>
+      <w:r>
+        <w:t xml:space="preserve">, or </w:t>
+      </w:r>
+      <w:r>
+        <w:rPr>
+          <w:b/>
+          <w:bCs/>
+        </w:rPr>
+        <w:t xml:space="preserve">Sign out</w:t>
+      </w:r>
+      <w:r>
+        <w:t xml:space="preserve"> to discard them. Signing out yourself also discards any changes the Hub kept on this computer.</w:t>
+      </w:r>
+    </w:p>
+    <w:p>
+      <w:pPr>
+        <w:pStyle w:val="Heading3"/>
+      </w:pPr>
+      <w:r>
+        <w:t xml:space="preserve">If a screen can't be shown</w:t>
+      </w:r>
+    </w:p>
+    <w:p>
+      <w:pPr>
+        <w:spacing w:after="120"/>
+      </w:pPr>
+      <w:r>
+        <w:t xml:space="preserve">If something goes wrong on a screen, you see "Something went wrong" and "This page couldn't be shown. Reload the page to try again." Choose </w:t>
+      </w:r>
+      <w:r>
+        <w:rPr>
+          <w:b/>
+          <w:bCs/>
+        </w:rPr>
+        <w:t xml:space="preserve">Reload</w:t>
+      </w:r>
+      <w:r>
+        <w:t xml:space="preserve">, or </w:t>
+      </w:r>
+      <w:r>
+        <w:rPr>
+          <w:b/>
+          <w:bCs/>
+        </w:rPr>
+        <w:t xml:space="preserve">Go to the start page</w:t>
+      </w:r>
+      <w:r>
+        <w:t xml:space="preserve">. The side menu still works. If it keeps happening, tell a Core administrator.</w:t>
+      </w:r>
+    </w:p>
+    <w:p>
+      <w:pPr>
+        <w:spacing w:after="120"/>
+      </w:pPr>
+      <w:r>
+        <w:t xml:space="preserve">An address that doesn't lead to a screen shows "Page not found", with </w:t>
+      </w:r>
+      <w:r>
+        <w:rPr>
+          <w:b/>
+          <w:bCs/>
+        </w:rPr>
+        <w:t xml:space="preserve">Go to the start page</w:t>
+      </w:r>
+      <w:r>
+        <w:t xml:space="preserve">.</w:t>
       </w:r>
     </w:p>
     <w:sectPr>

</xml_diff>

<commit_message>
1e0b7e94016e486aad354a83226241ac0617f6f0 deploy: siteground artifact
</commit_message>
<xml_diff>
--- a/hub/manuals/calendar-admin.docx
+++ b/hub/manuals/calendar-admin.docx
@@ -2398,7 +2398,7 @@
         <w:spacing w:after="120"/>
       </w:pPr>
       <w:r>
-        <w:t xml:space="preserve">Deactivating closes the person's Hub account. They can't sign in again until reactivated, and the Hub signs them out within 10 minutes.</w:t>
+        <w:t xml:space="preserve">Deactivating closes the person's Hub account. It signs them out at once, everywhere in the Hub, and they can't sign in again until reactivated.</w:t>
       </w:r>
     </w:p>
     <w:p>
@@ -2556,7 +2556,7 @@
         <w:t xml:space="preserve">Deactivate anyway</w:t>
       </w:r>
       <w:r>
-        <w:t xml:space="preserve"> when activities are listed. You see that the person "is deactivated. The Calendar picks this up within a minute."</w:t>
+        <w:t xml:space="preserve"> when activities are listed. You see that the person "is deactivated and signed out. The Calendar's lists catch up within a minute."</w:t>
       </w:r>
     </w:p>
     <w:p>
@@ -6180,6 +6180,37 @@
       </w:pPr>
       <w:r>
         <w:t xml:space="preserve">While a Hub tab is open, it keeps you signed in, even when the tab sits behind other windows. Your session can still end: when you sign out in another tab or window, when your computer has been asleep or offline for a while (it can be as little as a few minutes, and is never more than an hour), when the browser has put a tab it hasn't shown for a long time to sleep, or when an administrator changes your account.</w:t>
+      </w:r>
+    </w:p>
+    <w:p>
+      <w:pPr>
+        <w:spacing w:after="120"/>
+      </w:pPr>
+      <w:r>
+        <w:t xml:space="preserve">A session lasts up to 12 hours from when you signed in, however long the tab stays open. After that you sign in again.</w:t>
+      </w:r>
+    </w:p>
+    <w:p>
+      <w:pPr>
+        <w:spacing w:after="120"/>
+      </w:pPr>
+      <w:r>
+        <w:rPr>
+          <w:b/>
+          <w:bCs/>
+        </w:rPr>
+        <w:t xml:space="preserve">Sign out</w:t>
+      </w:r>
+      <w:r>
+        <w:t xml:space="preserve"> ends the session in that browser, including its other tabs. You stay signed in on any other computer or browser where you signed in. If an administrator deactivates your account, you are signed out at once, and signing in again tells you "Your account is not active. Contact a Core administrator."</w:t>
+      </w:r>
+    </w:p>
+    <w:p>
+      <w:pPr>
+        <w:spacing w:after="120"/>
+      </w:pPr>
+      <w:r>
+        <w:t xml:space="preserve">If the Hub says "The Hub can't check your sign-in right now. Try again in a minute.", you are still signed in and nothing on the screen is lost, but nothing can be saved or opened for now. Wait a minute and try again. The message goes away by itself once the Hub can check again. The sign-in page shows the same message then, and if signing in itself can't work for a while it says "We can't sign you in right now. Try again in a few minutes."</w:t>
       </w:r>
     </w:p>
     <w:p>

</xml_diff>

<commit_message>
87d77059165972e84f9df1783043cadccceddd38 deploy: siteground artifact
</commit_message>
<xml_diff>
--- a/hub/manuals/calendar-admin.docx
+++ b/hub/manuals/calendar-admin.docx
@@ -76,7 +76,7 @@
           <w:sz w:val="24"/>
           <w:szCs w:val="24"/>
         </w:rPr>
-        <w:t xml:space="preserve">Software version of October 31, 2026</w:t>
+        <w:t xml:space="preserve">Software version of November 1, 2026</w:t>
       </w:r>
     </w:p>
     <w:p>
@@ -6129,7 +6129,17 @@
         <w:spacing w:after="120"/>
       </w:pPr>
       <w:r>
-        <w:t xml:space="preserve">Retrying an old change is safe. If a newer change to the same activity has already reached Releases, the newer one stays.</w:t>
+        <w:t xml:space="preserve">Retrying an old change is safe. If a newer change to the same activity has already reached Releases, the newer one stays. If a newer change to the same activity is also waiting here, </w:t>
+      </w:r>
+      <w:r>
+        <w:rPr>
+          <w:b/>
+          <w:bCs/>
+        </w:rPr>
+        <w:t xml:space="preserve">Retry</w:t>
+      </w:r>
+      <w:r>
+        <w:t xml:space="preserve"> on the older one says "A newer update replaced this one, so it isn't sent again.": retry the newest one instead.</w:t>
       </w:r>
     </w:p>
     <w:p>

</xml_diff>